<commit_message>
Piece 1: Erratas corrected + minor housekeeping edits.
</commit_message>
<xml_diff>
--- a/Working Folder/1 Xie Xiangming 谢湘铭 - A Stroll in the Lion City 狮城漫步/1_Front-Matter.docx
+++ b/Working Folder/1 Xie Xiangming 谢湘铭 - A Stroll in the Lion City 狮城漫步/1_Front-Matter.docx
@@ -2202,7 +2202,7 @@
     <w:p>
       <w:pPr>
         <w:rPr>
-          <w:rFonts w:ascii="Noto Serif SC" w:eastAsia="Noto Serif SC" w:hAnsi="Noto Serif SC" w:cs="Noto Serif"/>
+          <w:rFonts w:ascii="Noto Serif SC" w:eastAsia="Noto Serif SC" w:hAnsi="Noto Serif SC" w:cs="Noto Serif" w:hint="eastAsia"/>
           <w:sz w:val="24"/>
           <w:szCs w:val="24"/>
         </w:rPr>
@@ -2617,7 +2617,7 @@
           <w:sz w:val="20"/>
           <w:szCs w:val="20"/>
         </w:rPr>
-        <w:t>中国小钹</w:t>
+        <w:t>小钹</w:t>
       </w:r>
       <w:r>
         <w:rPr>
@@ -2633,7 +2633,7 @@
           <w:sz w:val="20"/>
           <w:szCs w:val="20"/>
         </w:rPr>
-        <w:t>中国大钹</w:t>
+        <w:t>大钹</w:t>
       </w:r>
       <w:r>
         <w:rPr>
@@ -2649,7 +2649,7 @@
           <w:sz w:val="20"/>
           <w:szCs w:val="20"/>
         </w:rPr>
-        <w:t>西洋对镲</w:t>
+        <w:t>西洋镲</w:t>
       </w:r>
       <w:r>
         <w:rPr>

</xml_diff>

<commit_message>
Tiny fixes to percussion instrument names.
</commit_message>
<xml_diff>
--- a/Working Folder/1 Xie Xiangming 谢湘铭 - A Stroll in the Lion City 狮城漫步/1_Front-Matter.docx
+++ b/Working Folder/1 Xie Xiangming 谢湘铭 - A Stroll in the Lion City 狮城漫步/1_Front-Matter.docx
@@ -2202,7 +2202,7 @@
     <w:p>
       <w:pPr>
         <w:rPr>
-          <w:rFonts w:ascii="Noto Serif SC" w:eastAsia="Noto Serif SC" w:hAnsi="Noto Serif SC" w:cs="Noto Serif" w:hint="eastAsia"/>
+          <w:rFonts w:ascii="Noto Serif SC" w:eastAsia="Noto Serif SC" w:hAnsi="Noto Serif SC" w:cs="Noto Serif"/>
           <w:sz w:val="24"/>
           <w:szCs w:val="24"/>
         </w:rPr>
@@ -2581,19 +2581,19 @@
       </w:r>
       <w:r>
         <w:rPr>
-          <w:rFonts w:ascii="Noto Serif SC" w:eastAsia="Noto Serif SC" w:hAnsi="Noto Serif SC" w:cs="Noto Serif" w:hint="eastAsia"/>
-          <w:sz w:val="20"/>
-          <w:szCs w:val="20"/>
-        </w:rPr>
-        <w:t>鞭子</w:t>
-      </w:r>
-      <w:r>
-        <w:rPr>
-          <w:rFonts w:ascii="Noto Serif SC" w:eastAsia="Noto Serif SC" w:hAnsi="Noto Serif SC" w:cs="Noto Serif"/>
-          <w:sz w:val="20"/>
-          <w:szCs w:val="20"/>
-        </w:rPr>
-        <w:t xml:space="preserve"> Whip, </w:t>
+          <w:rFonts w:ascii="Noto Serif SC" w:eastAsia="Noto Serif SC" w:hAnsi="Noto Serif SC" w:cs="Noto Serif"/>
+          <w:sz w:val="20"/>
+          <w:szCs w:val="20"/>
+        </w:rPr>
+        <w:t>乐鞭</w:t>
+      </w:r>
+      <w:r>
+        <w:rPr>
+          <w:rFonts w:ascii="Noto Serif SC" w:eastAsia="Noto Serif SC" w:hAnsi="Noto Serif SC" w:cs="Noto Serif"/>
+          <w:sz w:val="20"/>
+          <w:szCs w:val="20"/>
+        </w:rPr>
+        <w:t xml:space="preserve">Whip, </w:t>
       </w:r>
       <w:r>
         <w:rPr>
@@ -2657,7 +2657,7 @@
           <w:sz w:val="20"/>
           <w:szCs w:val="20"/>
         </w:rPr>
-        <w:t xml:space="preserve"> Crash Cymbals</w:t>
+        <w:t xml:space="preserve"> Cymbals</w:t>
       </w:r>
     </w:p>
     <w:p>
@@ -3604,7 +3604,6 @@
   <w:style w:type="character" w:default="1" w:styleId="DefaultParagraphFont">
     <w:name w:val="Default Paragraph Font"/>
     <w:uiPriority w:val="1"/>
-    <w:semiHidden/>
     <w:unhideWhenUsed/>
   </w:style>
   <w:style w:type="table" w:default="1" w:styleId="TableNormal">

</xml_diff>